<commit_message>
papers: When AI Services Fail v1.0.1 (fix section 5 numbering and test-run labels); update landing page and provenance
v1.0.1 PDF 186768 B sha256 c56ea6b9...91c2dd; DOCX 55283 B sha256 45d8868c...6ef6ad.
v1.0 retained as superseded identity in provenance.json. Draft; not publication ALLOW.

Co-Authored-By: Claude Opus 5.5 <noreply@anthropic.com>
Claude-Session: https://claude.ai/code/session_017wK4qnzLmXcH9QhKXXA8BD
</commit_message>
<xml_diff>
--- a/papers/when-ai-services-fail/when-ai-services-fail.docx
+++ b/papers/when-ai-services-fail/when-ai-services-fail.docx
@@ -12,7 +12,7 @@
     </w:p>
     <w:p>
       <w:r>
-        <w:t>Full evidence-integrated research manuscript | Version 1.0 — verified publication edition | 26 October 2026</w:t>
+        <w:t>Full evidence-integrated research manuscript | Version 1.0.1 — final edition | 28 October 2026 (corrects v1.0 §5 procedure numbering and reference-model test labels)</w:t>
       </w:r>
     </w:p>
     <w:p>
@@ -626,10 +626,13 @@
         <w:pStyle w:val="ListNumber"/>
       </w:pPr>
       <w:r>
-        <w:t>1. Reserve or meter entitlement at task start; preserve the pre-task balance or capacity state.</w:t>
+        <w:t>Reserve or meter entitlement at task start; preserve the pre-task balance or capacity state.</w:t>
       </w:r>
     </w:p>
     <w:p>
+      <w:pPr>
+        <w:pStyle w:val="ListNumber"/>
+      </w:pPr>
       <w:r>
         <w:t>The remediation operation is keyed by attempt ID, original charge ID, policy version, and effective entitlement window. Apply no more than one effective adjustment per eligible charge; preserve audit records for duplicate, replay, partial side-effect and wrong-window attempts. Effective restored access matters more than a cosmetic display adjustment.</w:t>
       </w:r>
@@ -639,7 +642,7 @@
         <w:pStyle w:val="ListNumber"/>
       </w:pPr>
       <w:r>
-        <w:t>5. Return a receipt showing original debit, adjustment, remaining entitlement, decision reason, and an appeal path.</w:t>
+        <w:t>Return a receipt showing original debit, adjustment, remaining entitlement, decision reason, and an appeal path.</w:t>
       </w:r>
     </w:p>
     <w:p>
@@ -647,7 +650,7 @@
         <w:pStyle w:val="ListNumber"/>
       </w:pPr>
       <w:r>
-        <w:t>6. For uncertain cases, preserve evidence, avoid claiming success, and provide timely review; never silently discard contradictory observations.</w:t>
+        <w:t>For uncertain cases, preserve evidence, avoid claiming success, and provide timely review; never silently discard contradictory observations.</w:t>
       </w:r>
     </w:p>
     <w:p>
@@ -1125,7 +1128,7 @@
     </w:p>
     <w:p>
       <w:r>
-        <w:t>The eight-of-eight reference-model unit tests were reproduced in the present manuscript-finalization environment; earlier author-only runs were not independently reproduced at the time of those reports. They demonstrate only the bounded example logic, not production readiness, provider conformance, or authenticated ledger restoration.</w:t>
+        <w:t>The eight-of-eight reference-model unit tests were re-run by the manuscript author in the manuscript-finalization environment; neither that run nor the earlier author runs is a reviewer-independent reproduction. They demonstrate only the bounded example logic, not production readiness, provider conformance, or authenticated ledger restoration.</w:t>
       </w:r>
     </w:p>
     <w:p>
@@ -1363,7 +1366,7 @@
     <w:p>
       <w:pPr/>
       <w:r>
-        <w:t>REPRODUCED — Executed the bundled local Python reference model with Python 3: eight unit tests passed (including idempotence, zero/negative charges, unknown attribution, success and provider failure). This is an independent run in the present environment, but not a provider integration or independent external laboratory audit.</w:t>
+        <w:t>AUTHOR RE-RUN — Executed the bundled local Python reference model with Python 3: eight unit tests passed (including idempotence, zero/negative charges, unknown attribution, success and provider failure). This is a second run by the manuscript author in the present environment, not a reviewer-independent reproduction, provider integration or external laboratory audit.</w:t>
       </w:r>
     </w:p>
     <w:p>
@@ -1611,7 +1614,7 @@
           </w:tcPr>
           <w:p>
             <w:r>
-              <w:t>8/8 local; not independently reproduced</w:t>
+              <w:t>8/8 in two author runs; not independently reproduced</w:t>
             </w:r>
           </w:p>
         </w:tc>
@@ -1654,10 +1657,7 @@
     </w:p>
     <w:p>
       <w:r>
-        <w:t>R1 — Kimi membership pricing and plan distinctions: https://www.kimi.com/en/help/membership/membership-pricing . New plans: rolling five-hour window without weekly limit; legacy plans: rolling five-hour and weekly limits. The five-hour window is not five hours of weekly usage.</w:t>
-      </w:r>
-      <w:r>
-        <w:t xml:space="preserve"> The separate Kimi pricing page still uses generalized “5 hours per week” language; this conflict is documented rather than silently reconciled.</w:t>
+        <w:t xml:space="preserve">R1 — Kimi membership pricing and plan distinctions: https://www.kimi.com/en/help/membership/membership-pricing . New plans: rolling five-hour window without weekly limit; legacy plans: rolling five-hour and weekly limits. The five-hour window is not five hours of weekly usage. The separate Kimi pricing page still uses generalized “5 hours per week” language; this conflict is documented rather than silently reconciled.</w:t>
       </w:r>
     </w:p>
     <w:p>
@@ -1841,7 +1841,7 @@
       <w:jc w:val="center"/>
     </w:pPr>
     <w:r>
-      <w:t>When AI Services Fail | Full research | Final verified edition</w:t>
+      <w:t>When AI Services Fail | Full research | Final edition v1.0.1</w:t>
     </w:r>
   </w:p>
 </w:ftr>

</xml_diff>

<commit_message>
papers: stage When AI Services Fail v1.0.2 (editorial only) with landing page and provenance
PDF 185184 B sha256 6459b867...cca414; DOCX 55308 B sha256 4aecca49...bd715fe.
Staged branch; not proposed into #1633 until the independent v1.0.1 readback.

Co-Authored-By: Claude Opus 5.5 <noreply@anthropic.com>
Claude-Session: https://claude.ai/code/session_017wK4qnzLmXcH9QhKXXA8BD
</commit_message>
<xml_diff>
--- a/papers/when-ai-services-fail/when-ai-services-fail.docx
+++ b/papers/when-ai-services-fail/when-ai-services-fail.docx
@@ -12,7 +12,7 @@
     </w:p>
     <w:p>
       <w:r>
-        <w:t>Full evidence-integrated research manuscript | Version 1.0.1 — final edition | 28 October 2026 (corrects v1.0 §5 procedure numbering and reference-model test labels)</w:t>
+        <w:t>Full evidence-integrated research manuscript | Version 1.0.2 — final edition | 28 October 2026 (v1.0.1: §5 procedure numbering and reference-model test labels; v1.0.2: editorial — duplicate §5 preamble removed, stray heading number, duplicate source URL, current ERL PR head)</w:t>
       </w:r>
     </w:p>
     <w:p>
@@ -112,7 +112,7 @@
     </w:p>
     <w:p>
       <w:r>
-        <w:t>Kimi primary sources: https://www.kimi.com/en/help/agent/agent-quota-and-billing ; https://www.kimi.com/en/help/agent/agent-quota-and-billing ; https://www.kimi.com/en/help/membership/membership-update-rules ; Kimi pricing/plan geometry: https://www.kimi.com/en/help/membership/membership-pricing . Frozen source and reviewer interpretation: https://github.com/SV-LLM/Ecosystem_Chat/issues/9#issuecomment-6428435857 and https://github.com/SV-LLM/Ecosystem_Chat/issues/9#issuecomment-6429453316</w:t>
+        <w:t>Kimi primary sources: https://www.kimi.com/en/help/agent/agent-quota-and-billing ; https://www.kimi.com/en/help/membership/membership-update-rules ; Kimi pricing/plan geometry: https://www.kimi.com/en/help/membership/membership-pricing . Frozen source and reviewer interpretation: https://github.com/SV-LLM/Ecosystem_Chat/issues/9#issuecomment-6428435857 and https://github.com/SV-LLM/Ecosystem_Chat/issues/9#issuecomment-6429453316</w:t>
       </w:r>
     </w:p>
     <w:tbl>
@@ -535,7 +535,7 @@
     </w:p>
     <w:p>
       <w:r>
-        <w:t>REPORTED / UNMERGED / PUBLICATION NOT AUTHORIZED: at least fifteen instances were described in ERL PR #247, head 8ae786bc. Locator only: https://github.com/StegVerse-Labs/Executive_Rhetoric_Ledger/pull/247 . No restricted case text is reproduced. This is evidence of recorded complaints and continuation work, not verified entitlement depletion.</w:t>
+        <w:t>REPORTED / UNMERGED / PUBLICATION NOT AUTHORIZED: at least fifteen instances were described in ERL PR #247 (head 878da1b8 as of 28 October 2026). Locator only: https://github.com/StegVerse-Labs/Executive_Rhetoric_Ledger/pull/247 . No restricted case text is reproduced. This is evidence of recorded complaints and continuation work, not verified entitlement depletion.</w:t>
       </w:r>
     </w:p>
     <w:p>
@@ -557,18 +557,6 @@
       </w:pPr>
       <w:r>
         <w:t>5. Engineering analysis and proposed accounting standard</w:t>
-      </w:r>
-    </w:p>
-    <w:p>
-      <w:pPr/>
-      <w:r>
-        <w:t>In safety-critical construction, required performance is specified before a design is approved; inadequate materials are not made adequate by a later apology. AI services are not governed by identical building codes, but the engineering analogy illustrates a useful design principle: foreseeable operational failure modes should be investigated, instrumented, tested, and addressed before a service is monetized under specific performance representations.</w:t>
-      </w:r>
-    </w:p>
-    <w:p>
-      <w:pPr/>
-      <w:r>
-        <w:t>A competent software process includes failure-mode analysis, acceptance criteria, negative testing, accounting reconciliation, escalation paths, and rollback or compensation mechanisms. Where an objectively identifiable failure category exists, an engineering team should either demonstrate an effective control, narrow the product claim, or disclose the residual limitation. The existence of an alternative provider implementation is evidence of technical feasibility for that category, not proof of universal feasibility or an identical legal obligation.</w:t>
       </w:r>
     </w:p>
     <w:p>
@@ -1105,7 +1093,7 @@
         <w:pStyle w:val="Title"/>
       </w:pPr>
       <w:r>
-        <w:t>27. Executable reference model and observed test results</w:t>
+        <w:t>Executable reference model and observed test results</w:t>
       </w:r>
     </w:p>
     <w:p>
@@ -1841,7 +1829,7 @@
       <w:jc w:val="center"/>
     </w:pPr>
     <w:r>
-      <w:t>When AI Services Fail | Full research | Final edition v1.0.1</w:t>
+      <w:t>When AI Services Fail | Full research | Final edition v1.0.2</w:t>
     </w:r>
   </w:p>
 </w:ftr>

</xml_diff>

<commit_message>
papers (staged v1.0.3): merged #247 locator and post-freeze Kimi history-depth note
Staged only; not integrated into #1633. PDF 186,269 B sha256 463fce02...;
DOCX 55,591 B sha256 be72df87.... Exactly three paragraph changes plus
footer over v1.0.2. publication_status stays NOT_ALLOWED; independent
v1.0.3 verification PENDING.

Co-Authored-By: Claude Opus 5.5 <noreply@anthropic.com>
Claude-Session: https://claude.ai/code/session_017wK4qnzLmXcH9QhKXXA8BD
</commit_message>
<xml_diff>
--- a/papers/when-ai-services-fail/when-ai-services-fail.docx
+++ b/papers/when-ai-services-fail/when-ai-services-fail.docx
@@ -12,7 +12,7 @@
     </w:p>
     <w:p>
       <w:r>
-        <w:t>Full evidence-integrated research manuscript | Version 1.0.2 — final edition | 28 October 2026 (v1.0.1: §5 procedure numbering and reference-model test labels; v1.0.2: editorial — duplicate §5 preamble removed, stray heading number, duplicate source URL, current ERL PR head)</w:t>
+        <w:t>Full evidence-integrated research manuscript | Version 1.0.3 — final edition | 29 October 2026 (v1.0.1: §5 procedure numbering and reference-model test labels; v1.0.2: editorial — duplicate §5 preamble removed, stray heading number, duplicate source URL, current ERL PR head; v1.0.3: Case C-2 locator updated to the merged ERL record; post-freeze Kimi history-depth documentation conflict added to §2.3)</w:t>
       </w:r>
     </w:p>
     <w:p>
@@ -535,7 +535,7 @@
     </w:p>
     <w:p>
       <w:r>
-        <w:t>REPORTED / UNMERGED / PUBLICATION NOT AUTHORIZED: at least fifteen instances were described in ERL PR #247 (head 878da1b8 as of 28 October 2026). Locator only: https://github.com/StegVerse-Labs/Executive_Rhetoric_Ledger/pull/247 . No restricted case text is reproduced. This is evidence of recorded complaints and continuation work, not verified entitlement depletion.</w:t>
+        <w:t>REPORTED / RECORD MERGED / PUBLICATION NOT AUTHORIZED: at least fifteen instances are recorded in ERL PR #247, merged 29 October 2026 (merge commit e6b2193d). Locator only: https://github.com/StegVerse-Labs/Executive_Rhetoric_Ledger/pull/247 . No restricted case text is reproduced; the merge records the instances in the ledger and does not authorize publication of restricted case text. This is evidence of recorded complaints and continuation work, not verified entitlement depletion.</w:t>
       </w:r>
     </w:p>
     <w:p>
@@ -1342,6 +1342,12 @@
     <w:p>
       <w:pPr/>
       <w:r>
+        <w:t>POST-FREEZE ADDENDUM / DOCUMENTATION CONFLICT — Kimi’s Agent quota-and-billing help page says customers can view “the 10 most recent usage records”, while the membership pricing page says “your most recent 1,000 usage records”. Two official pages state different history depths for the same customer view. Reported by Kimi on 27 October 2026 (https://github.com/SV-LLM/Ecosystem_Chat/issues/9#issuecomment-6448760483 ) after the evidence freeze, and rechecked on both pages on 29 October 2026. This is a published-documentation inconsistency; it is not evidence of how many records the underlying ledger retains. https://www.kimi.com/en/help/agent/agent-quota-and-billing ; https://www.kimi.com/en/help/membership/membership-pricing</w:t>
+      </w:r>
+    </w:p>
+    <w:p>
+      <w:pPr/>
+      <w:r>
         <w:t>RECHECKED — FTC June 25, 2025 announcement states more than $126 million distributed in that round and nearly $200 million cumulative refunds. The $245 million settlement amount is separate. This is consumer-protection context, not a ruling about AI prompt credits. https://search.ftc.gov/news-events/news/press-releases/2025/06/ftc-sends-126-million-refunds-fortnite-players-who-were-charged-unwanted-items-reopens-claims ; https://www.ftc.gov/legal-library/browse/cases-proceedings/1923203-epic-games-matter</w:t>
       </w:r>
     </w:p>
@@ -1829,7 +1835,7 @@
       <w:jc w:val="center"/>
     </w:pPr>
     <w:r>
-      <w:t>When AI Services Fail | Full research | Final edition v1.0.2</w:t>
+      <w:t>When AI Services Fail | Full research | Final edition v1.0.3</w:t>
     </w:r>
   </w:p>
 </w:ftr>

</xml_diff>